<commit_message>
rework état des connaissances sur les autres dossiers avec passage de la brick en commune.
</commit_message>
<xml_diff>
--- a/src/reportgenerator/dossiers/natura2000/template.docx
+++ b/src/reportgenerator/dossiers/natura2000/template.docx
@@ -4465,7 +4465,7 @@
     </w:p>
     <w:p>
       <w:r>
-        <w:t>Cette section ne mesure pas la biodiversité du site : elle décrit ce que les données disponibles permettent d'en dire. Une maille sans donnée, ou avec peu d'espèces, n'est pas forcément pauvre : elle peut simplement avoir été peu prospectée. Les analyses reposent sur une grille de mailles de 1 km × 1 km couvrant le site et le kilomètre autour, identique sur toutes les cartes, et sur les données de la période {{PERIODE_ETUDE}}. Elles répondent à trois questions : où a-t-on prospecté ? connaît-on bien chaque groupe à cet endroit ? où se trouvent les espèces à enjeux ?</w:t>
+        <w:t>Cette section ne mesure pas la biodiversité du site : elle décrit ce que les données disponibles permettent d'en dire. Une maille sans donnée, ou avec peu d'espèces, n'est pas forcément pauvre : elle peut simplement avoir été peu prospectée. Elles reposent sur une grille de mailles de 1 km × 1 km couvrant {{CONNAISSANCE_EMPRISE}}, identique sur toutes les cartes, et répondent à trois questions : où a-t-on prospecté ? connaît-on bien chaque groupe à cet endroit ? où se trouvent les espèces à enjeux ?</w:t>
       </w:r>
     </w:p>
     <w:p>
@@ -4481,12 +4481,12 @@
     </w:p>
     <w:p>
       <w:r>
-        <w:t>Deux indicateurs décrivent l'effort de prospection, toutes espèces confondues. Le nombre de données par maille reflète l'activité d'observation, mais il est gonflé par les inventaires intensifs ou les comptages répétés en un même lieu. Le nombre de jours d'observation (nombre de dates différentes avec au moins une donnée) mesure mieux l'effort réel : une maille visitée 30 jours différents est mieux connue qu'une maille où 100 données ont été saisies lors d'une seule sortie. Les mailles grises ne comptent qu'une donnée (ou un seul jour d'observation) : leur connaissance est jugée insuffisante. Les mailles blanches n'ont aucune donnée.</w:t>
-      </w:r>
-    </w:p>
-    <w:p>
-      <w:r>
-        <w:t>{{Carte03a_effort_donnees}}</w:t>
+        <w:t>Deux indicateurs décrivent l'effort de prospection, tous groupes étudiés confondus. Le nombre de données par maille reflète l'activité d'observation, mais il est gonflé par les inventaires intensifs ou les comptages répétés en un même lieu. Le nombre de jours d'observation (nombre de dates différentes avec au moins une donnée) mesure mieux l'effort réel : une maille visitée 30 jours différents est mieux connue qu'une maille où 100 données ont été saisies lors d'une seule sortie. Les mailles grises ne comptent qu'une donnée (ou un seul jour d'observation) : leur connaissance est jugée insuffisante. Les mailles blanches n'ont aucune donnée.</w:t>
+      </w:r>
+    </w:p>
+    <w:p>
+      <w:r>
+        <w:t>{{Connaissance_effort_donnees}}</w:t>
       </w:r>
     </w:p>
     <w:p>
@@ -4509,12 +4509,12 @@
         </w:r>
       </w:fldSimple>
       <w:r>
-        <w:t xml:space="preserve"> : Nombre de données par maille de 1 km, toutes espèces</w:t>
-      </w:r>
-    </w:p>
-    <w:p>
-      <w:r>
-        <w:t>{{Carte03b_effort_jours}}</w:t>
+        <w:t xml:space="preserve"> : Nombre de données par maille de 1 km</w:t>
+      </w:r>
+    </w:p>
+    <w:p>
+      <w:r>
+        <w:t>{{Connaissance_effort_jours}}</w:t>
       </w:r>
     </w:p>
     <w:p>
@@ -4537,7 +4537,7 @@
         </w:r>
       </w:fldSimple>
       <w:r>
-        <w:t xml:space="preserve"> : Nombre de jours d'observation par maille de 1 km, toutes espèces</w:t>
+        <w:t xml:space="preserve"> : Nombre de jours d'observation par maille de 1 km</w:t>
       </w:r>
     </w:p>
     <w:p>
@@ -4553,7 +4553,7 @@
     </w:p>
     <w:p>
       <w:r>
-        <w:t>Pour chaque groupe taxonomique, le nombre d'espèces observées dans une maille est rapporté au nombre d'espèces du même groupe connues dans un rayon de {{POOL_LOCAL_KM}} km autour du site (« espèces locales »). Cette référence est réaliste : elle ne compte que des espèces présentes dans le même contexte géographique, alors qu'une référence régionale inclurait des espèces de montagne ou de plaine absentes du secteur et pénaliserait les groupes riches en espèces localisées. Le tableau suivant donne, par groupe, le nombre d'espèces connues dans le site et le kilomètre autour et la part qu'elles représentent des espèces locales ; le nombre d'espèces connues en région est donné pour mémoire. Il indique aussi le nombre de mailles renseignées (dont celles avec moins de {{SEUIL_PEU_DONNEES}} données), le nombre médian de jours d'observation par maille et si le groupe est cartographié.</w:t>
+        <w:t>Pour chaque groupe taxonomique, le nombre d'espèces observées dans une maille est rapporté au nombre d'espèces du même groupe connues dans un rayon de {{POOL_LOCAL_KM}} km autour du site (« espèces locales »). Cette référence est réaliste : elle ne compte que des espèces présentes dans le même contexte géographique, alors qu'une référence régionale inclurait des espèces de montagne ou de plaine absentes du secteur et pénaliserait les groupes riches en espèces localisées. Le tableau suivant donne, par groupe, le nombre d'espèces connues dans le site et dans l'emprise des mailles, et la part qu'elles représentent des espèces locales ; le nombre d'espèces connues en région est donné pour mémoire. Il indique aussi le nombre de mailles renseignées (dont celles avec moins de {{SEUIL_PEU_DONNEES}} données), le nombre médian de jours d'observation par maille et si le groupe est cartographié.</w:t>
       </w:r>
     </w:p>
     <w:p>
@@ -4624,7 +4624,7 @@
     </w:p>
     <w:p>
       <w:r>
-        <w:t>Ces cartes décrivent l'état de la connaissance et non la valeur écologique des mailles. Elles se lisent avec les cartes d'effort ci-dessus : une zone peu prospectée, toutes espèces confondues, ne peut pas être jugée pauvre. Les suivis ciblés (comptages, protocoles) concentrent aussi l'effort sur quelques mailles.</w:t>
+        <w:t>Ces cartes décrivent l'état de la connaissance et non la valeur écologique des mailles. Elles se lisent avec les cartes d'effort ci-dessus : une zone peu prospectée ne peut pas être jugée pauvre. Les suivis ciblés (comptages, protocoles) concentrent aussi l'effort sur quelques mailles.</w:t>
       </w:r>
     </w:p>
     <w:p>

</xml_diff>